<commit_message>
[AUTO] 2026-06-26 08:58 自动提交·3个文件变更
</commit_message>
<xml_diff>
--- a/output/_smoketest/基金推荐报告_张女士_20260626.docx
+++ b/output/_smoketest/基金推荐报告_张女士_20260626.docx
@@ -902,7 +902,7 @@
                 <w:color w:val="17202A"/>
                 <w:sz w:val="22"/>
               </w:rPr>
-              <w:t>（见 computed 远期区间）</w:t>
+              <w:t>（详见完整版报告远期估计）</w:t>
             </w:r>
           </w:p>
         </w:tc>
@@ -944,7 +944,7 @@
           <w:color w:val="17202A"/>
           <w:sz w:val="24"/>
         </w:rPr>
-        <w:t>【计算方法】基于 2022-02-23~2026-06-25 各成份基金累计净值、按目标权重买入持有合成的组合净值序列计算（峰谷法/历史模拟，非正态假设）；数据截止 2026-06-26。历史表现不代表未来，本数字为历史实测，非预测值。</w:t>
+        <w:t>【数据来源】以上数字由投资组合量化模型基于成份基金历史净值序列测算，数据截止 2026-06-26。历史表现不代表未来，本数字为历史实测结果，非收益承诺。</w:t>
       </w:r>
     </w:p>
     <w:p>
@@ -2990,7 +2990,7 @@
           <w:color w:val="17202A"/>
           <w:sz w:val="24"/>
         </w:rPr>
-        <w:t>卫星层20%：权益敞口超过20%将触碰恐慌赎回线；低于15%则3年难以完成6%+目标。20%是在回撤约束与收益目标之间测算的平衡点，详见 computed 分层指标。</w:t>
+        <w:t>卫星层20%：权益敞口超过20%将触碰恐慌赎回线；低于15%则3年难以完成6%+目标。20%是在回撤约束与收益目标之间经量化模型测算的平衡点。</w:t>
       </w:r>
     </w:p>
     <w:p>
@@ -3004,7 +3004,7 @@
           <w:color w:val="17202A"/>
           <w:sz w:val="24"/>
         </w:rPr>
-        <w:t>对冲层10%：黄金与债股相关性极低，加入后可将组合最大回撤从实测的-9.6%压低至-9.4%（改善0.2个百分点，两次 portfolio_math 实测之差）。这10%是「保险丝」，不是为了赚钱。</w:t>
+        <w:t>对冲层10%：黄金与债股相关性极低，加入后可将组合最大回撤从实测的-9.6%压低至-9.4%（改善0.2个百分点，经投资组合量化模型两次独立测算所得）。这10%是「保险丝」，不是为了赚钱。</w:t>
       </w:r>
     </w:p>
     <w:p>
@@ -3018,7 +3018,7 @@
           <w:color w:val="17202A"/>
           <w:sz w:val="24"/>
         </w:rPr>
-        <w:t>【对冲测算】对冲层边际作用 = 含对冲层组合回撤 - 不含对冲层组合回撤，均为 portfolio_math 实测。</w:t>
+        <w:t>【对冲测算】对冲层边际作用 = 含对冲层组合回撤 - 不含对冲层组合回撤，均为投资组合量化模型实测结果。</w:t>
       </w:r>
     </w:p>
     <w:p>
@@ -3591,7 +3591,7 @@
           <w:color w:val="17202A"/>
           <w:sz w:val="24"/>
         </w:rPr>
-        <w:t>【计算方法】基于 2022-02-23~2026-06-25 各成份基金累计净值、按目标权重买入持有合成的组合净值序列计算（峰谷法/历史模拟，非正态假设）；数据截止 2026-06-26。历史表现不代表未来，本数字为历史实测，非预测值。</w:t>
+        <w:t>【数据来源】以上数字由投资组合量化模型基于成份基金历史净值序列测算，数据截止 2026-06-26。历史表现不代表未来，本数字为历史实测结果，非收益承诺。</w:t>
       </w:r>
     </w:p>
     <w:p>
@@ -4076,7 +4076,7 @@
           <w:color w:val="17202A"/>
           <w:sz w:val="24"/>
         </w:rPr>
-        <w:t>本报告所有风险/收益数字均来自 portfolio_math 引擎基于真实净值序列的计算，或来自带时效标注的外置宏观常量。以下为核心假设，供客户复核：</w:t>
+        <w:t>本报告所有风险/收益数字均由投资组合量化模型基于真实净值序列测算，或来自带时效标注的外置宏观常量。以下为核心假设，供客户复核：</w:t>
       </w:r>
     </w:p>
     <w:p>

</xml_diff>

<commit_message>
[AUTO] 2026-06-26 09:03 自动提交·3个文件变更
</commit_message>
<xml_diff>
--- a/output/_smoketest/基金推荐报告_张女士_20260626.docx
+++ b/output/_smoketest/基金推荐报告_张女士_20260626.docx
@@ -3255,7 +3255,7 @@
                 <w:color w:val="17202A"/>
                 <w:sz w:val="22"/>
               </w:rPr>
-              <w:t>12.5万元（核心层最坏加权影响 -12.5%，来自 portfolio_math）</w:t>
+              <w:t>12.5万元（核心层最坏加权影响 -12.5%，经量化模型测算）</w:t>
             </w:r>
           </w:p>
         </w:tc>
@@ -3353,7 +3353,7 @@
                 <w:color w:val="17202A"/>
                 <w:sz w:val="22"/>
               </w:rPr>
-              <w:t>2.7万元（卫星层最坏加权影响 -2.7%，来自 portfolio_math）</w:t>
+              <w:t>2.7万元（卫星层最坏加权影响 -2.7%，经量化模型测算）</w:t>
             </w:r>
           </w:p>
         </w:tc>
@@ -3451,7 +3451,7 @@
                 <w:color w:val="17202A"/>
                 <w:sz w:val="22"/>
               </w:rPr>
-              <w:t>3.0万元（对冲层最坏加权影响 -2.9%，来自 portfolio_math）</w:t>
+              <w:t>3.0万元（对冲层最坏加权影响 -2.9%，经量化模型测算）</w:t>
             </w:r>
           </w:p>
         </w:tc>

</xml_diff>